<commit_message>
docs(demo): refresh Tutor guide and genuine UI walkthrough
</commit_message>
<xml_diff>
--- a/example/competition-materials/学途智伴技能说明文档.docx
+++ b/example/competition-materials/学途智伴技能说明文档.docx
@@ -20,7 +20,7 @@
     </w:p>
     <w:p>
       <w:r>
-        <w:t>队伍  重邮FFBond    赛道  校园生活    Skill  Teach Pro 1.1.0-rc.3</w:t>
+        <w:t>队伍  重邮FFBond    赛道  校园生活    Skill  Teach Pro 1.1.0-rc.4</w:t>
       </w:r>
     </w:p>
     <w:p>
@@ -810,12 +810,12 @@
     </w:p>
     <w:p>
       <w:r>
-        <w:t>课程设置保存非密钥连接参数；API Key 仅保留在本次服务进程内存中，重启后重新输入。获取模型列表和连接测试不发送课程正文。课内答疑经用户确认后发送本课正文与图注、当前问题、选中片段和有限近期聊天，不自动读取其他课程或完整学员画像。</w:t>
+        <w:t>课程设置保存非密钥连接参数；API Key 仅保留在本次服务进程内存中，重启后重新输入。获取模型列表和连接测试不发送课程正文。学员点击发送后，答疑结合本课正文与图注、当前问题、选中片段和最近五个完整成功回合，不自动读取其他课程或完整学员画像。</w:t>
       </w:r>
     </w:p>
     <w:p>
       <w:r>
-        <w:t>本地保存不等于本地推理。选择云端提供商时，确认的数据仍会发往该服务。作答、聊天和配置已加入忽略规则；公开 Demo 不包含原始学员提交、聊天或密钥。本服务用于单用户本机学习。</w:t>
+        <w:t>本地保存不等于本地推理，云端答疑会把限定上下文发往所选服务。作答、聊天和配置已加入忽略规则；公开 Demo 不包含原始学员提交、聊天或密钥。本服务用于单用户本机学习。</w:t>
       </w:r>
     </w:p>
     <w:p>
@@ -972,7 +972,7 @@
         <w:t xml:space="preserve">2 获取并选择模型  </w:t>
       </w:r>
       <w:r>
-        <w:t>确认提供商说明后点击“获取模型”，从实际返回的列表选择模型。不支持列表时可手动填写模型 ID；不要把历史名称当成当前可用模型。</w:t>
+        <w:t>点击“获取模型”，从实际列表选择 deepseek-flash，再保存并启用。不支持列表时可手动填写模型 ID。地址、输出预算与思考模式放在高级设置中。</w:t>
       </w:r>
     </w:p>
     <w:p>
@@ -984,8 +984,8 @@
       <w:r>
         <w:drawing>
           <wp:inline xmlns:a="http://schemas.openxmlformats.org/drawingml/2006/main" xmlns:pic="http://schemas.openxmlformats.org/drawingml/2006/picture">
-            <wp:extent cx="5852160" cy="2322528"/>
-            <wp:docPr id="4" name="Picture 4" descr="图 4 DeepSeek 预设与遮蔽输入  使用无效演示值 未获取或伪造模型列表"/>
+            <wp:extent cx="5212080" cy="3963924"/>
+            <wp:docPr id="4" name="Picture 4" descr="图 4 简化后的 DeepSeek 设置  图中密钥为无效演示值"/>
             <wp:cNvGraphicFramePr>
               <a:graphicFrameLocks noChangeAspect="1"/>
             </wp:cNvGraphicFramePr>
@@ -1005,7 +1005,7 @@
                   <pic:spPr>
                     <a:xfrm>
                       <a:off x="0" y="0"/>
-                      <a:ext cx="5852160" cy="2322528"/>
+                      <a:ext cx="5212080" cy="3963924"/>
                     </a:xfrm>
                     <a:prstGeom prst="rect"/>
                   </pic:spPr>
@@ -1022,7 +1022,7 @@
         <w:jc w:val="left"/>
       </w:pPr>
       <w:r>
-        <w:t>图 4 DeepSeek 预设与遮蔽输入  使用无效演示值 未获取或伪造模型列表</w:t>
+        <w:t>图 4 简化后的 DeepSeek 设置  图中密钥为无效演示值</w:t>
       </w:r>
     </w:p>
     <w:p>
@@ -1033,7 +1033,7 @@
         <w:t xml:space="preserve">3 保存并测试  </w:t>
       </w:r>
       <w:r>
-        <w:t>保存设置后 Key 输入框清空，密钥保留在服务内存中。测试连接发送最小请求，可能计费。成功后返回当前课，确认上下文范围再提问。</w:t>
+        <w:t>保存后 Key 输入框清空，密钥留在服务内存中。测试连接发送简短请求；普通 Flash 答疑默认关闭思考，聊天预算默认 4096 token，连接测试预算独立。</w:t>
       </w:r>
     </w:p>
     <w:p>
@@ -1041,15 +1041,105 @@
         <w:rPr>
           <w:b/>
         </w:rPr>
-        <w:t xml:space="preserve">4 保留课内讨论  </w:t>
+        <w:t xml:space="preserve">4 返回当前课提问  </w:t>
       </w:r>
       <w:r>
-        <w:t>聊天按课自动保存到 learner-chats，续课 AI 可将讨论作为参考。答疑不执行工具、不修改教程，也不自动生成下一课。</w:t>
+        <w:t>点击“问 AI”进入大弹窗，直接提问或继续追问，无需粘贴课文或重复勾选。未配置也能继续学习。</w:t>
+      </w:r>
+    </w:p>
+    <w:p>
+      <w:pPr>
+        <w:pStyle w:val="Heading1"/>
+        <w:pageBreakBefore/>
+      </w:pPr>
+      <w:r>
+        <w:t>课内对话体验</w:t>
       </w:r>
     </w:p>
     <w:p>
       <w:r>
-        <w:t>HTTP 400 不足以判断 Key 有误，还应核对地址、实际模型 ID 与请求格式。服务重启后需重新输入 Key。本轮仅验证设置交互与未配置答疑状态，真实模型获取、连接及聊天成功仍待实际操作确认。</w:t>
+        <w:t>答疑窗口把注意力集中在当前疑问上：顶部显示课节与模型，正文以连续文档流呈现，输入区固定在底部。标题、列表、强调、代码和表格按 Markdown 排版，代码支持复制，长内容在局部滚动。</w:t>
+      </w:r>
+    </w:p>
+    <w:p>
+      <w:pPr>
+        <w:keepNext/>
+        <w:spacing w:before="100" w:after="60"/>
+        <w:jc w:val="center"/>
+      </w:pPr>
+      <w:r>
+        <w:drawing>
+          <wp:inline xmlns:a="http://schemas.openxmlformats.org/drawingml/2006/main" xmlns:pic="http://schemas.openxmlformats.org/drawingml/2006/picture">
+            <wp:extent cx="5852160" cy="3291840"/>
+            <wp:docPr id="5" name="Picture 5" descr="图 5 DeepSeek Flash 本次真实第三轮答疑  模型回答原样展示"/>
+            <wp:cNvGraphicFramePr>
+              <a:graphicFrameLocks noChangeAspect="1"/>
+            </wp:cNvGraphicFramePr>
+            <a:graphic>
+              <a:graphicData uri="http://schemas.openxmlformats.org/drawingml/2006/picture">
+                <pic:pic>
+                  <pic:nvPicPr>
+                    <pic:cNvPr id="0" name="tutor-dialog.png"/>
+                    <pic:cNvPicPr/>
+                  </pic:nvPicPr>
+                  <pic:blipFill>
+                    <a:blip r:embed="rId14"/>
+                    <a:stretch>
+                      <a:fillRect/>
+                    </a:stretch>
+                  </pic:blipFill>
+                  <pic:spPr>
+                    <a:xfrm>
+                      <a:off x="0" y="0"/>
+                      <a:ext cx="5852160" cy="3291840"/>
+                    </a:xfrm>
+                    <a:prstGeom prst="rect"/>
+                  </pic:spPr>
+                </pic:pic>
+              </a:graphicData>
+            </a:graphic>
+          </wp:inline>
+        </w:drawing>
+      </w:r>
+    </w:p>
+    <w:p>
+      <w:pPr>
+        <w:pStyle w:val="Caption"/>
+        <w:jc w:val="left"/>
+      </w:pPr>
+      <w:r>
+        <w:t>图 5 DeepSeek Flash 本次真实第三轮答疑  模型回答原样展示</w:t>
+      </w:r>
+    </w:p>
+    <w:p>
+      <w:r>
+        <w:t>学员可以先给出自己的判断，再让模型指出推理缺口。演示中，三轮交流依次讨论学校公告、新邮箱与外发权限，最后澄清系统提示与运行时授权的区别。即时答疑辅助理解，学员的解释和应用仍须另行检查。</w:t>
+      </w:r>
+    </w:p>
+    <w:p>
+      <w:pPr>
+        <w:pStyle w:val="Heading2"/>
+      </w:pPr>
+      <w:r>
+        <w:t>保持对话连续</w:t>
+      </w:r>
+    </w:p>
+    <w:p>
+      <w:r>
+        <w:t>聊天原始 Markdown 自动保存到本课 JSON。关闭窗口保留草稿，已发送请求继续接收；刷新恢复历史，阅读旧消息时新回答不会强制跳到底。支持引用课文、Enter 发送、Shift 加 Enter 换行、输入法保护，以及备份和确认清空。</w:t>
+      </w:r>
+    </w:p>
+    <w:p>
+      <w:pPr>
+        <w:pStyle w:val="Heading2"/>
+      </w:pPr>
+      <w:r>
+        <w:t>请求状态清晰</w:t>
+      </w:r>
+    </w:p>
+    <w:p>
+      <w:r>
+        <w:t>服务区分正常回答、部分正文、预算耗尽、异常结构和连接失败。未完成回答明确标记，学员可主动重试最近问题；重试关联原记录，不重复插入提问。有限诊断记录结束原因、用量与耗时，不保存思考原文或认证信息。</w:t>
       </w:r>
     </w:p>
     <w:p>
@@ -1063,7 +1153,7 @@
     </w:p>
     <w:p>
       <w:r>
-        <w:t>Demo 按“评估起点、学习一课、保存作答、依据误区调整教学”的过程展示。页面包含三节课、一手阅读中心与教学决策回放，共八页。视频计划采用同一 Demo，时长控制在三分钟以内，演示输入与回放明确标注，API Key 始终遮蔽。</w:t>
+        <w:t>Demo 共八页，包含三节校核课程、阅读中心与决策回放。新版画面依次展示评估、图解、疑问、配置、真实答疑、保存与续课，时长不足三分钟，密钥始终遮蔽。配音另行制作。</w:t>
       </w:r>
     </w:p>
     <w:p>
@@ -1369,7 +1459,7 @@
     </w:p>
     <w:p>
       <w:r>
-        <w:t>上述三种选择已在 TeleAgent v2.5.2 中观察到。测试使用合成即时作答，推进分支基于人工修订的前课；原生课文仍有概念和状态错误。展示课程经人工校核，不能据此宣称无人干预闭环或长期学习效果已验证。</w:t>
+        <w:t>三种选择均在 TeleAgent v2.5.2 中观察到，使用合成即时作答，推进分支基于人工修订的前课。原生课文仍有概念与状态错误，展示课程已校核；无人干预闭环和长期学习效果尚未验证。</w:t>
       </w:r>
     </w:p>
     <w:p>
@@ -1524,7 +1614,7 @@
                 <w:color w:val="000000"/>
                 <w:sz w:val="20"/>
               </w:rPr>
-              <w:t>Node 14/14、Python 15/15；八页结构通过</w:t>
+              <w:t>Node 16/16、Python 37/37；八页结构及 Skill 校验通过</w:t>
             </w:r>
           </w:p>
         </w:tc>
@@ -1561,7 +1651,7 @@
                 <w:color w:val="000000"/>
                 <w:sz w:val="20"/>
               </w:rPr>
-              <w:t>排版与即时检查</w:t>
+              <w:t>弹窗与排版</w:t>
             </w:r>
           </w:p>
         </w:tc>
@@ -1593,7 +1683,7 @@
                 <w:color w:val="000000"/>
                 <w:sz w:val="20"/>
               </w:rPr>
-              <w:t>390/1366px 无横向溢出；十一题反馈与恢复正常</w:t>
+              <w:t>1440、1280、390px 布局通过；Markdown、输入法、滚动与关闭恢复正常</w:t>
             </w:r>
           </w:p>
         </w:tc>
@@ -1699,7 +1789,7 @@
                 <w:color w:val="000000"/>
                 <w:sz w:val="20"/>
               </w:rPr>
-              <w:t>设置与未配置答疑</w:t>
+              <w:t>真实模型请求</w:t>
             </w:r>
           </w:p>
         </w:tc>
@@ -1731,7 +1821,7 @@
                 <w:color w:val="000000"/>
                 <w:sz w:val="20"/>
               </w:rPr>
-              <w:t>DeepSeek 地址预填、Key 遮蔽通过；无配置时发送禁用</w:t>
+              <w:t>DeepSeek Flash 模型列表、连接测试、三轮答疑均成功</w:t>
             </w:r>
           </w:p>
         </w:tc>
@@ -1813,14 +1903,14 @@
     </w:p>
     <w:p>
       <w:r>
-        <w:t>以上为 Windows 本地验收，未调用真实提供商，也未完成 macOS/Linux 实机启动或真实学员长期效果测试。详细记录保留检查步骤、原生失败项与产物哈希，便于复核。</w:t>
+        <w:t>页面回归使用合成接口，真实 DeepSeek 请求独立记录。当前验收限于 Windows，未验证 macOS/Linux 实机启动。教学分支保留原生失败项，不因界面升级改记为通过。</w:t>
       </w:r>
     </w:p>
     <w:p>
       <w:pPr>
         <w:pStyle w:val="Source"/>
       </w:pPr>
-      <w:hyperlink r:id="rId14">
+      <w:hyperlink r:id="rId15">
         <w:r>
           <w:rPr>
             <w:color w:val="173B55"/>
@@ -1833,12 +1923,12 @@
       <w:pPr>
         <w:pStyle w:val="Source"/>
       </w:pPr>
-      <w:hyperlink r:id="rId15">
+      <w:hyperlink r:id="rId16">
         <w:r>
           <w:rPr>
             <w:color w:val="173B55"/>
           </w:rPr>
-          <w:t>Demo 运行验收记录  2026 年 10 月 1 日</w:t>
+          <w:t>Tutor 体验与真实演示验收  2026 年 10 月 2 日</w:t>
         </w:r>
       </w:hyperlink>
     </w:p>
@@ -1846,7 +1936,7 @@
       <w:pPr>
         <w:pStyle w:val="Source"/>
       </w:pPr>
-      <w:hyperlink r:id="rId16">
+      <w:hyperlink r:id="rId17">
         <w:r>
           <w:rPr>
             <w:color w:val="173B55"/>

</xml_diff>